<commit_message>
Captains Page part 2
</commit_message>
<xml_diff>
--- a/Documents/2026/The_Amateurs_Rule_Sheet.docx
+++ b/Documents/2026/The_Amateurs_Rule_Sheet.docx
@@ -748,61 +748,6 @@
         </w:rPr>
         <w:t xml:space="preserve"> 0 points</w:t>
       </w:r>
-    </w:p>
-    <w:p>
-      <w:pPr>
-        <w:numPr>
-          <w:ilvl w:val="1"/>
-          <w:numId w:val="2"/>
-        </w:numPr>
-        <w:pBdr>
-          <w:top w:val="nil"/>
-          <w:left w:val="nil"/>
-          <w:bottom w:val="nil"/>
-          <w:right w:val="nil"/>
-          <w:between w:val="nil"/>
-        </w:pBdr>
-        <w:rPr>
-          <w:rFonts w:ascii="Big Caslon Medium" w:eastAsia="Big Caslon Medium" w:hAnsi="Big Caslon Medium" w:cs="Big Caslon Medium"/>
-          <w:color w:val="000000"/>
-        </w:rPr>
-      </w:pPr>
-      <w:r>
-        <w:rPr>
-          <w:rFonts w:ascii="Big Caslon Medium" w:eastAsia="Big Caslon Medium" w:hAnsi="Big Caslon Medium" w:cs="Big Caslon Medium"/>
-          <w:color w:val="000000"/>
-        </w:rPr>
-        <w:t xml:space="preserve">Triple Bogey (Double Par) </w:t>
-      </w:r>
-      <w:r>
-        <w:rPr>
-          <w:rFonts w:ascii="Big Caslon Medium" w:eastAsia="Big Caslon Medium" w:hAnsi="Big Caslon Medium" w:cs="Big Caslon Medium"/>
-        </w:rPr>
-        <w:t>→</w:t>
-      </w:r>
-      <w:r>
-        <w:rPr>
-          <w:rFonts w:ascii="Big Caslon Medium" w:eastAsia="Big Caslon Medium" w:hAnsi="Big Caslon Medium" w:cs="Big Caslon Medium"/>
-          <w:color w:val="000000"/>
-        </w:rPr>
-        <w:t xml:space="preserve"> -2 points</w:t>
-      </w:r>
-    </w:p>
-    <w:p>
-      <w:pPr>
-        <w:pBdr>
-          <w:top w:val="nil"/>
-          <w:left w:val="nil"/>
-          <w:bottom w:val="nil"/>
-          <w:right w:val="nil"/>
-          <w:between w:val="nil"/>
-        </w:pBdr>
-        <w:ind w:left="1440"/>
-        <w:rPr>
-          <w:rFonts w:ascii="Big Caslon Medium" w:eastAsia="Big Caslon Medium" w:hAnsi="Big Caslon Medium" w:cs="Big Caslon Medium"/>
-          <w:color w:val="000000"/>
-        </w:rPr>
-      </w:pPr>
     </w:p>
     <w:p>
       <w:pPr>
@@ -1106,6 +1051,7 @@
           <w:bCs/>
           <w:color w:val="000000"/>
         </w:rPr>
+        <w:lastRenderedPageBreak/>
         <w:t>Hole #1:</w:t>
       </w:r>
       <w:r>

</xml_diff>